<commit_message>
fix: improve discovery privacy logic to avoid hidden buttons
</commit_message>
<xml_diff>
--- a/docs/tdis/ETAPA_2_PLAYHUB_ABNT.docx
+++ b/docs/tdis/ETAPA_2_PLAYHUB_ABNT.docx
@@ -439,6 +439,7 @@
     </w:p>
     <w:p>
       <w:pPr>
+        <w:keepNext/>
         <w:spacing w:before="160" w:after="80" w:line="240" w:lineRule="auto"/>
         <w:ind w:firstLine="0"/>
         <w:jc w:val="center"/>
@@ -872,6 +873,7 @@
     </w:p>
     <w:p>
       <w:pPr>
+        <w:keepNext/>
         <w:spacing w:before="160" w:after="80" w:line="240" w:lineRule="auto"/>
         <w:ind w:firstLine="0"/>
         <w:jc w:val="center"/>
@@ -2299,6 +2301,7 @@
     </w:p>
     <w:p>
       <w:pPr>
+        <w:keepNext/>
         <w:spacing w:before="160" w:after="80" w:line="240" w:lineRule="auto"/>
         <w:ind w:firstLine="0"/>
         <w:jc w:val="center"/>
@@ -2441,6 +2444,7 @@
     </w:p>
     <w:p>
       <w:pPr>
+        <w:keepNext/>
         <w:spacing w:before="160" w:after="80" w:line="240" w:lineRule="auto"/>
         <w:ind w:firstLine="0"/>
         <w:jc w:val="center"/>
@@ -3349,6 +3353,7 @@
     </w:p>
     <w:p>
       <w:pPr>
+        <w:keepNext/>
         <w:spacing w:before="160" w:after="80" w:line="240" w:lineRule="auto"/>
         <w:ind w:firstLine="0"/>
         <w:jc w:val="center"/>
@@ -4302,17 +4307,15 @@
       <w:pStyle w:val="Header"/>
       <w:jc w:val="right"/>
     </w:pPr>
-    <w:r>
-      <w:rPr>
-        <w:rFonts w:ascii="Times New Roman" w:hAnsi="Times New Roman" w:eastAsia="Times New Roman"/>
-        <w:sz w:val="20"/>
-      </w:rPr>
-      <w:fldChar w:fldCharType="begin"/>
-      <w:instrText xml:space="preserve">PAGE</w:instrText>
-      <w:fldChar w:fldCharType="separate"/>
-      <w:t>1</w:t>
-      <w:fldChar w:fldCharType="end"/>
-    </w:r>
+    <w:fldSimple w:instr="PAGE">
+      <w:r>
+        <w:rPr>
+          <w:rFonts w:ascii="Times New Roman" w:hAnsi="Times New Roman" w:eastAsia="Times New Roman"/>
+          <w:sz w:val="20"/>
+        </w:rPr>
+        <w:t>1</w:t>
+      </w:r>
+    </w:fldSimple>
   </w:p>
 </w:hdr>
 </file>

</xml_diff>

<commit_message>
fix: enforce strict privacy for athletes not explicitly opted-in
</commit_message>
<xml_diff>
--- a/docs/tdis/ETAPA_2_PLAYHUB_ABNT.docx
+++ b/docs/tdis/ETAPA_2_PLAYHUB_ABNT.docx
@@ -438,6 +438,11 @@
       </w:r>
     </w:p>
     <w:p>
+      <w:r>
+        <w:br w:type="page"/>
+      </w:r>
+    </w:p>
+    <w:p>
       <w:pPr>
         <w:keepNext/>
         <w:spacing w:before="160" w:after="80" w:line="240" w:lineRule="auto"/>
@@ -869,6 +874,11 @@
           <w:sz w:val="20"/>
         </w:rPr>
         <w:t>Fonte: Elaborado pelos autores (2026).</w:t>
+      </w:r>
+    </w:p>
+    <w:p>
+      <w:r>
+        <w:br w:type="page"/>
       </w:r>
     </w:p>
     <w:p>

</xml_diff>

<commit_message>
feat: voting optimization, load performance and bug fixes in hall of fame
</commit_message>
<xml_diff>
--- a/docs/tdis/ETAPA_2_PLAYHUB_ABNT.docx
+++ b/docs/tdis/ETAPA_2_PLAYHUB_ABNT.docx
@@ -73,7 +73,7 @@
           <w:b/>
           <w:sz w:val="24"/>
         </w:rPr>
-        <w:t>RELATÓRIO DE ACOMPANHAMENTO DO ARTIGO - ETAPA 2</w:t>
+        <w:t>TRABALHO ACADÊMICO</w:t>
       </w:r>
     </w:p>
     <w:p>
@@ -180,9 +180,15 @@
       </w:r>
     </w:p>
     <w:p>
-      <w:r>
-        <w:br w:type="page"/>
-      </w:r>
+      <w:pPr>
+        <w:sectPr>
+          <w:headerReference w:type="default" r:id="rId9"/>
+          <w:pgSz w:w="12240" w:h="15840"/>
+          <w:pgMar w:top="1701" w:right="1134" w:bottom="1134" w:left="1701" w:header="709" w:footer="720" w:gutter="0"/>
+          <w:cols w:space="720"/>
+          <w:docGrid w:linePitch="360"/>
+        </w:sectPr>
+      </w:pPr>
     </w:p>
     <w:p>
       <w:pPr>
@@ -198,7 +204,7 @@
           <w:color w:val="1F2937"/>
           <w:sz w:val="24"/>
         </w:rPr>
-        <w:t>1 CONTINUIDADE DA ETAPA 1 E DELIMITAÇÃO DO ESTUDO</w:t>
+        <w:t>1 INTRODUÇÃO E DELIMITAÇÃO DO ESTUDO</w:t>
       </w:r>
     </w:p>
     <w:p>
@@ -212,7 +218,7 @@
           <w:rFonts w:ascii="Times New Roman" w:hAnsi="Times New Roman" w:eastAsia="Times New Roman"/>
           <w:sz w:val="24"/>
         </w:rPr>
-        <w:t>A Etapa 1 definiu como problema de pesquisa a análise do impacto da adoção de uma plataforma digital baseada em governança e automação, o PlayHub, sobre a eficiência operacional, a transparência das informações e a experiência dos usuários em grupos esportivos amadores. Esta Etapa 2 dá continuidade a essa formulação, mantendo a questão central e refinando a hipótese geral em constructos mensuráveis, referencial teórico e metodologia de pesquisa.</w:t>
+        <w:t>Este trabalho analisa a adoção de uma plataforma digital baseada em governança e automação, o PlayHub, em grupos esportivos amadores. O foco está em compreender de que modo a plataforma pode afetar a eficiência operacional, a transparência das informações e a experiência dos usuários em rotinas de organização esportiva realizadas, em geral, por administradores voluntários.</w:t>
       </w:r>
     </w:p>
     <w:p>
@@ -240,7 +246,7 @@
           <w:rFonts w:ascii="Times New Roman" w:hAnsi="Times New Roman" w:eastAsia="Times New Roman"/>
           <w:sz w:val="24"/>
         </w:rPr>
-        <w:t>O ajuste conceitual proposto nesta etapa é tratar o PlayHub não apenas como aplicativo operacional, mas como uma intervenção de transformação digital em micro-sistemas de serviço. A literatura recente compreende a transformação digital como a integração entre tecnologia, gestão/processos e pessoas para redefinir proposições de valor e melhorar operações (DE LEON et al., 2025). Essa leitura é aderente ao caso, pois a plataforma altera simultaneamente a ferramenta utilizada, a forma de governança do grupo e o papel dos participantes na organização do serviço.</w:t>
+        <w:t>Para fins analíticos, o PlayHub é tratado não apenas como aplicativo operacional, mas como uma intervenção de transformação digital em micro-sistemas de serviço. A literatura recente compreende a transformação digital como a integração entre tecnologia, gestão/processos e pessoas para redefinir proposições de valor e melhorar operações (DE LEON et al., 2025). Essa leitura é aderente ao caso, pois a plataforma altera simultaneamente a ferramenta utilizada, a forma de governança do grupo e o papel dos participantes na organização do serviço.</w:t>
       </w:r>
     </w:p>
     <w:p>
@@ -254,7 +260,7 @@
           <w:rFonts w:ascii="Times New Roman" w:hAnsi="Times New Roman" w:eastAsia="Times New Roman"/>
           <w:sz w:val="24"/>
         </w:rPr>
-        <w:t>Também se propõe substituir expressões excessivamente promocionais, como “sistema revolucionário” ou “punição algorítmica”, por termos academicamente mais precisos: governança digital assistida, automação de regras, coordenação digital e ecossistema de plataforma. Essa mudança preserva a ideia original da Etapa 1, mas melhora a aderência ao padrão científico esperado em um trabalho de mestrado.</w:t>
+        <w:t>Na redação acadêmica, opta-se por termos moderados e tecnicamente mais precisos, como governança digital assistida, automação de regras, coordenação digital e ecossistema de plataforma. Essa escolha evita uma apresentação promocional da solução e permite discutir o PlayHub com maior cautela, como objeto de análise em um trabalho de disciplina de mestrado.</w:t>
       </w:r>
     </w:p>
     <w:p>
@@ -347,7 +353,7 @@
           <w:rFonts w:ascii="Times New Roman" w:hAnsi="Times New Roman" w:eastAsia="Times New Roman"/>
           <w:sz w:val="24"/>
         </w:rPr>
-        <w:t>Mapear as funcionalidades do PlayHub relacionadas à governança digital, à gestão financeira, à agenda de partidas, à confirmação de presença, ao perfil esportivo e ao matchmaking entre atletas e equipes.</w:t>
+        <w:t>Descrever as funcionalidades do PlayHub relacionadas à governança digital, à gestão financeira, à confirmação de presença e à comunicação das regras do grupo.</w:t>
       </w:r>
     </w:p>
     <w:p>
@@ -361,7 +367,7 @@
           <w:rFonts w:ascii="Times New Roman" w:hAnsi="Times New Roman" w:eastAsia="Times New Roman"/>
           <w:sz w:val="24"/>
         </w:rPr>
-        <w:t>Mensurar a variação percebida na eficiência operacional dos administradores após a adoção da plataforma, considerando tempo de gestão, esforço de coordenação e carga cognitiva.</w:t>
+        <w:t>Avaliar, por meio de survey com administradores e participantes, a percepção sobre eficiência operacional, transparência das informações e experiência do usuário antes e após o uso da plataforma.</w:t>
       </w:r>
     </w:p>
     <w:p>
@@ -375,35 +381,7 @@
           <w:rFonts w:ascii="Times New Roman" w:hAnsi="Times New Roman" w:eastAsia="Times New Roman"/>
           <w:sz w:val="24"/>
         </w:rPr>
-        <w:t>Avaliar a percepção dos usuários quanto à transparência das informações, especialmente regras, status financeiro, critérios de presença e comunicação das decisões do grupo.</w:t>
-      </w:r>
-    </w:p>
-    <w:p>
-      <w:pPr>
-        <w:pStyle w:val="ListBullet"/>
-        <w:spacing w:after="80" w:line="360" w:lineRule="auto"/>
-        <w:ind w:left="709" w:hanging="283"/>
-      </w:pPr>
-      <w:r>
-        <w:rPr>
-          <w:rFonts w:ascii="Times New Roman" w:hAnsi="Times New Roman" w:eastAsia="Times New Roman"/>
-          <w:sz w:val="24"/>
-        </w:rPr>
-        <w:t>Analisar a experiência dos usuários com a plataforma, considerando facilidade de uso, clareza da interface, satisfação e intenção de recomendação.</w:t>
-      </w:r>
-    </w:p>
-    <w:p>
-      <w:pPr>
-        <w:pStyle w:val="ListBullet"/>
-        <w:spacing w:after="80" w:line="360" w:lineRule="auto"/>
-        <w:ind w:left="709" w:hanging="283"/>
-      </w:pPr>
-      <w:r>
-        <w:rPr>
-          <w:rFonts w:ascii="Times New Roman" w:hAnsi="Times New Roman" w:eastAsia="Times New Roman"/>
-          <w:sz w:val="24"/>
-        </w:rPr>
-        <w:t>Relacionar os resultados empíricos aos constructos identificados na literatura sobre transformação digital, ecossistemas de plataforma, coordenação de equipes mediada digitalmente e experiência do usuário.</w:t>
+        <w:t>Relacionar os achados da pesquisa aos principais conceitos da literatura sobre transformação digital, plataformas digitais, coordenação em esportes amadores e experiência do usuário.</w:t>
       </w:r>
     </w:p>
     <w:p>
@@ -434,7 +412,35 @@
           <w:rFonts w:ascii="Times New Roman" w:hAnsi="Times New Roman" w:eastAsia="Times New Roman"/>
           <w:sz w:val="24"/>
         </w:rPr>
-        <w:t>A bibliometria desta etapa foi organizada como um levantamento inicial do acervo bibliográfico disponível para o projeto. O objetivo não é substituir uma revisão sistemática completa, mas demonstrar rastreabilidade na seleção dos artigos que fundamentam o modelo conceitual e a metodologia. O corpus local contém 94 arquivos científicos em PDF, sendo 26 classificados como referencial direto e 68 como apoio complementar. Para a Etapa 2, foram priorizados artigos recentes, publicados entre 2023 e 2026, com aderência direta ao problema de pesquisa.</w:t>
+        <w:t>A bibliometria foi organizada como um levantamento inicial para orientar a seleção do referencial teórico. O objetivo não é realizar uma revisão sistemática completa, mas registrar um procedimento rastreável de busca, triagem e seleção de artigos.</w:t>
+      </w:r>
+    </w:p>
+    <w:p>
+      <w:pPr>
+        <w:spacing w:line="360" w:lineRule="auto" w:before="0" w:after="120"/>
+        <w:ind w:firstLine="709"/>
+        <w:jc w:val="both"/>
+      </w:pPr>
+      <w:r>
+        <w:rPr>
+          <w:rFonts w:ascii="Times New Roman" w:hAnsi="Times New Roman" w:eastAsia="Times New Roman"/>
+          <w:sz w:val="24"/>
+        </w:rPr>
+        <w:t>Foram consideradas as bases Scopus e Web of Science, com análise de títulos, resumos e palavras-chave para identificação dos estudos mais aderentes ao tema. Nesta versão, registra-se o corpus local mapeado, composto por 94 arquivos científicos em PDF, sendo 26 classificados como referencial direto e 68 como apoio complementar. Quando necessário, os textos completos foram consultados para confirmar a aderência ao problema de pesquisa.</w:t>
+      </w:r>
+    </w:p>
+    <w:p>
+      <w:pPr>
+        <w:spacing w:line="360" w:lineRule="auto" w:before="0" w:after="120"/>
+        <w:ind w:firstLine="709"/>
+        <w:jc w:val="both"/>
+      </w:pPr>
+      <w:r>
+        <w:rPr>
+          <w:rFonts w:ascii="Times New Roman" w:hAnsi="Times New Roman" w:eastAsia="Times New Roman"/>
+          <w:sz w:val="24"/>
+        </w:rPr>
+        <w:t>A triagem dos estudos foi realizada a partir da análise de títulos, resumos e palavras-chave, buscando identificar a aderência de cada publicação ao tema da pesquisa e aos constructos centrais do trabalho: transformação digital, plataformas digitais, governança, coordenação de grupos esportivos e experiência do usuário. Quando necessário, os textos completos foram consultados para confirmar a relação com o problema investigado, esclarecer a contribuição teórica do estudo e apoiar a seleção dos artigos mais relevantes para a construção do referencial teórico.</w:t>
       </w:r>
     </w:p>
     <w:p>
@@ -532,7 +538,223 @@
                 <w:b/>
                 <w:sz w:val="19"/>
               </w:rPr>
-              <w:t>Resultado adotado na Etapa 2</w:t>
+              <w:t>Procedimento adotado ou recomendado</w:t>
+            </w:r>
+          </w:p>
+        </w:tc>
+      </w:tr>
+      <w:tr>
+        <w:tc>
+          <w:tcPr>
+            <w:tcW w:type="dxa" w:w="2551"/>
+            <w:tcMar>
+              <w:top w:w="120" w:type="dxa"/>
+              <w:start w:w="110" w:type="dxa"/>
+              <w:bottom w:w="120" w:type="dxa"/>
+              <w:end w:w="110" w:type="dxa"/>
+            </w:tcMar>
+            <w:vAlign w:val="center"/>
+          </w:tcPr>
+          <w:p>
+            <w:pPr>
+              <w:spacing w:line="240" w:lineRule="auto" w:after="0"/>
+              <w:ind w:firstLine="0"/>
+              <w:jc w:val="left"/>
+            </w:pPr>
+            <w:r>
+              <w:rPr>
+                <w:rFonts w:ascii="Times New Roman" w:hAnsi="Times New Roman" w:eastAsia="Times New Roman"/>
+                <w:sz w:val="18"/>
+              </w:rPr>
+              <w:t>Bases de busca</w:t>
+            </w:r>
+          </w:p>
+        </w:tc>
+        <w:tc>
+          <w:tcPr>
+            <w:tcW w:type="dxa" w:w="5953"/>
+            <w:tcMar>
+              <w:top w:w="120" w:type="dxa"/>
+              <w:start w:w="110" w:type="dxa"/>
+              <w:bottom w:w="120" w:type="dxa"/>
+              <w:end w:w="110" w:type="dxa"/>
+            </w:tcMar>
+            <w:vAlign w:val="center"/>
+          </w:tcPr>
+          <w:p>
+            <w:pPr>
+              <w:spacing w:line="240" w:lineRule="auto" w:after="0"/>
+              <w:ind w:firstLine="0"/>
+              <w:jc w:val="left"/>
+            </w:pPr>
+            <w:r>
+              <w:rPr>
+                <w:rFonts w:ascii="Times New Roman" w:hAnsi="Times New Roman" w:eastAsia="Times New Roman"/>
+                <w:sz w:val="18"/>
+              </w:rPr>
+              <w:t>Scopus e Web of Science, com exportação dos resultados para registro dos quantitativos, remoção de duplicidades e triagem.</w:t>
+            </w:r>
+          </w:p>
+        </w:tc>
+      </w:tr>
+      <w:tr>
+        <w:tc>
+          <w:tcPr>
+            <w:tcW w:type="dxa" w:w="2551"/>
+            <w:tcMar>
+              <w:top w:w="120" w:type="dxa"/>
+              <w:start w:w="110" w:type="dxa"/>
+              <w:bottom w:w="120" w:type="dxa"/>
+              <w:end w:w="110" w:type="dxa"/>
+            </w:tcMar>
+            <w:vAlign w:val="center"/>
+          </w:tcPr>
+          <w:p>
+            <w:pPr>
+              <w:spacing w:line="240" w:lineRule="auto" w:after="0"/>
+              <w:ind w:firstLine="0"/>
+              <w:jc w:val="left"/>
+            </w:pPr>
+            <w:r>
+              <w:rPr>
+                <w:rFonts w:ascii="Times New Roman" w:hAnsi="Times New Roman" w:eastAsia="Times New Roman"/>
+                <w:sz w:val="18"/>
+              </w:rPr>
+              <w:t>String booleana sugerida</w:t>
+            </w:r>
+          </w:p>
+        </w:tc>
+        <w:tc>
+          <w:tcPr>
+            <w:tcW w:type="dxa" w:w="5953"/>
+            <w:tcMar>
+              <w:top w:w="120" w:type="dxa"/>
+              <w:start w:w="110" w:type="dxa"/>
+              <w:bottom w:w="120" w:type="dxa"/>
+              <w:end w:w="110" w:type="dxa"/>
+            </w:tcMar>
+            <w:vAlign w:val="center"/>
+          </w:tcPr>
+          <w:p>
+            <w:pPr>
+              <w:spacing w:line="240" w:lineRule="auto" w:after="0"/>
+              <w:ind w:firstLine="0"/>
+              <w:jc w:val="left"/>
+            </w:pPr>
+            <w:r>
+              <w:rPr>
+                <w:rFonts w:ascii="Times New Roman" w:hAnsi="Times New Roman" w:eastAsia="Times New Roman"/>
+                <w:sz w:val="18"/>
+              </w:rPr>
+              <w:t>("digital transformation" OR digitalization OR "digital platform*" OR "platform ecosystem*") AND (sport* OR "amateur sport*" OR fitness OR "sports organization*") AND ("user experience" OR "customer experience" OR governance OR coordination OR "value co-creation").</w:t>
+            </w:r>
+          </w:p>
+        </w:tc>
+      </w:tr>
+      <w:tr>
+        <w:tc>
+          <w:tcPr>
+            <w:tcW w:type="dxa" w:w="2551"/>
+            <w:tcMar>
+              <w:top w:w="120" w:type="dxa"/>
+              <w:start w:w="110" w:type="dxa"/>
+              <w:bottom w:w="120" w:type="dxa"/>
+              <w:end w:w="110" w:type="dxa"/>
+            </w:tcMar>
+            <w:vAlign w:val="center"/>
+          </w:tcPr>
+          <w:p>
+            <w:pPr>
+              <w:spacing w:line="240" w:lineRule="auto" w:after="0"/>
+              <w:ind w:firstLine="0"/>
+              <w:jc w:val="left"/>
+            </w:pPr>
+            <w:r>
+              <w:rPr>
+                <w:rFonts w:ascii="Times New Roman" w:hAnsi="Times New Roman" w:eastAsia="Times New Roman"/>
+                <w:sz w:val="18"/>
+              </w:rPr>
+              <w:t>Campos de busca</w:t>
+            </w:r>
+          </w:p>
+        </w:tc>
+        <w:tc>
+          <w:tcPr>
+            <w:tcW w:type="dxa" w:w="5953"/>
+            <w:tcMar>
+              <w:top w:w="120" w:type="dxa"/>
+              <w:start w:w="110" w:type="dxa"/>
+              <w:bottom w:w="120" w:type="dxa"/>
+              <w:end w:w="110" w:type="dxa"/>
+            </w:tcMar>
+            <w:vAlign w:val="center"/>
+          </w:tcPr>
+          <w:p>
+            <w:pPr>
+              <w:spacing w:line="240" w:lineRule="auto" w:after="0"/>
+              <w:ind w:firstLine="0"/>
+              <w:jc w:val="left"/>
+            </w:pPr>
+            <w:r>
+              <w:rPr>
+                <w:rFonts w:ascii="Times New Roman" w:hAnsi="Times New Roman" w:eastAsia="Times New Roman"/>
+                <w:sz w:val="18"/>
+              </w:rPr>
+              <w:t>Título, resumo e palavras-chave, ajustando a abrangência se o retorno for muito restrito.</w:t>
+            </w:r>
+          </w:p>
+        </w:tc>
+      </w:tr>
+      <w:tr>
+        <w:tc>
+          <w:tcPr>
+            <w:tcW w:type="dxa" w:w="2551"/>
+            <w:tcMar>
+              <w:top w:w="120" w:type="dxa"/>
+              <w:start w:w="110" w:type="dxa"/>
+              <w:bottom w:w="120" w:type="dxa"/>
+              <w:end w:w="110" w:type="dxa"/>
+            </w:tcMar>
+            <w:vAlign w:val="center"/>
+          </w:tcPr>
+          <w:p>
+            <w:pPr>
+              <w:spacing w:line="240" w:lineRule="auto" w:after="0"/>
+              <w:ind w:firstLine="0"/>
+              <w:jc w:val="left"/>
+            </w:pPr>
+            <w:r>
+              <w:rPr>
+                <w:rFonts w:ascii="Times New Roman" w:hAnsi="Times New Roman" w:eastAsia="Times New Roman"/>
+                <w:sz w:val="18"/>
+              </w:rPr>
+              <w:t>Triagem</w:t>
+            </w:r>
+          </w:p>
+        </w:tc>
+        <w:tc>
+          <w:tcPr>
+            <w:tcW w:type="dxa" w:w="5953"/>
+            <w:tcMar>
+              <w:top w:w="120" w:type="dxa"/>
+              <w:start w:w="110" w:type="dxa"/>
+              <w:bottom w:w="120" w:type="dxa"/>
+              <w:end w:w="110" w:type="dxa"/>
+            </w:tcMar>
+            <w:vAlign w:val="center"/>
+          </w:tcPr>
+          <w:p>
+            <w:pPr>
+              <w:spacing w:line="240" w:lineRule="auto" w:after="0"/>
+              <w:ind w:firstLine="0"/>
+              <w:jc w:val="left"/>
+            </w:pPr>
+            <w:r>
+              <w:rPr>
+                <w:rFonts w:ascii="Times New Roman" w:hAnsi="Times New Roman" w:eastAsia="Times New Roman"/>
+                <w:sz w:val="18"/>
+              </w:rPr>
+              <w:t>Uso do Rayyan para análise de títulos, resumos e palavras-chave, classificação de relevância e aplicação dos critérios de inclusão e exclusão.</w:t>
             </w:r>
           </w:p>
         </w:tc>
@@ -722,60 +944,6 @@
                 <w:rFonts w:ascii="Times New Roman" w:hAnsi="Times New Roman" w:eastAsia="Times New Roman"/>
                 <w:sz w:val="18"/>
               </w:rPr>
-              <w:t>Descritores temáticos</w:t>
-            </w:r>
-          </w:p>
-        </w:tc>
-        <w:tc>
-          <w:tcPr>
-            <w:tcW w:type="dxa" w:w="5953"/>
-            <w:tcMar>
-              <w:top w:w="120" w:type="dxa"/>
-              <w:start w:w="110" w:type="dxa"/>
-              <w:bottom w:w="120" w:type="dxa"/>
-              <w:end w:w="110" w:type="dxa"/>
-            </w:tcMar>
-            <w:vAlign w:val="center"/>
-          </w:tcPr>
-          <w:p>
-            <w:pPr>
-              <w:spacing w:line="240" w:lineRule="auto" w:after="0"/>
-              <w:ind w:firstLine="0"/>
-              <w:jc w:val="left"/>
-            </w:pPr>
-            <w:r>
-              <w:rPr>
-                <w:rFonts w:ascii="Times New Roman" w:hAnsi="Times New Roman" w:eastAsia="Times New Roman"/>
-                <w:sz w:val="18"/>
-              </w:rPr>
-              <w:t>digital transformation; sport; sports organizations; platform ecosystem; value co-creation; human-computer interaction; customer experience; smart algorithms; amateur sports organizing; mobile fitness applications.</w:t>
-            </w:r>
-          </w:p>
-        </w:tc>
-      </w:tr>
-      <w:tr>
-        <w:tc>
-          <w:tcPr>
-            <w:tcW w:type="dxa" w:w="2551"/>
-            <w:tcMar>
-              <w:top w:w="120" w:type="dxa"/>
-              <w:start w:w="110" w:type="dxa"/>
-              <w:bottom w:w="120" w:type="dxa"/>
-              <w:end w:w="110" w:type="dxa"/>
-            </w:tcMar>
-            <w:vAlign w:val="center"/>
-          </w:tcPr>
-          <w:p>
-            <w:pPr>
-              <w:spacing w:line="240" w:lineRule="auto" w:after="0"/>
-              <w:ind w:firstLine="0"/>
-              <w:jc w:val="left"/>
-            </w:pPr>
-            <w:r>
-              <w:rPr>
-                <w:rFonts w:ascii="Times New Roman" w:hAnsi="Times New Roman" w:eastAsia="Times New Roman"/>
-                <w:sz w:val="18"/>
-              </w:rPr>
               <w:t>Critérios de inclusão</w:t>
             </w:r>
           </w:p>
@@ -802,7 +970,7 @@
                 <w:rFonts w:ascii="Times New Roman" w:hAnsi="Times New Roman" w:eastAsia="Times New Roman"/>
                 <w:sz w:val="18"/>
               </w:rPr>
-              <w:t>Aderência ao PlayHub, publicação em periódico científico, relação com variáveis do modelo e contribuição para discutir eficiência, transparência ou experiência do usuário.</w:t>
+              <w:t>Aderência ao tema do PlayHub, publicação científica, relação com as variáveis do modelo e contribuição para discutir eficiência, transparência ou experiência do usuário.</w:t>
             </w:r>
           </w:p>
         </w:tc>
@@ -856,7 +1024,7 @@
                 <w:rFonts w:ascii="Times New Roman" w:hAnsi="Times New Roman" w:eastAsia="Times New Roman"/>
                 <w:sz w:val="18"/>
               </w:rPr>
-              <w:t>Materiais com baixa relação com o problema, duplicações temáticas e documentos sem contribuição direta para o constructo da Etapa 2.</w:t>
+              <w:t>Materiais com baixa relação com o problema, duplicações temáticas e documentos sem contribuição direta para os constructos da pesquisa.</w:t>
             </w:r>
           </w:p>
         </w:tc>
@@ -874,6 +1042,20 @@
           <w:sz w:val="20"/>
         </w:rPr>
         <w:t>Fonte: Elaborado pelos autores (2026).</w:t>
+      </w:r>
+    </w:p>
+    <w:p>
+      <w:pPr>
+        <w:spacing w:line="360" w:lineRule="auto" w:before="0" w:after="120"/>
+        <w:ind w:firstLine="709"/>
+        <w:jc w:val="both"/>
+      </w:pPr>
+      <w:r>
+        <w:rPr>
+          <w:rFonts w:ascii="Times New Roman" w:hAnsi="Times New Roman" w:eastAsia="Times New Roman"/>
+          <w:sz w:val="24"/>
+        </w:rPr>
+        <w:t>Com base nesses critérios, os artigos foram organizados em dois grupos: um referencial direto, composto por publicações com maior aderência ao problema de pesquisa, e um referencial complementar, utilizado para apoiar conceitos auxiliares. O Quadro 2 apresenta os estudos centrais selecionados, indicando o eixo teórico de contribuição de cada artigo para a análise do PlayHub.</w:t>
       </w:r>
     </w:p>
     <w:p>
@@ -2306,7 +2488,12 @@
           <w:rFonts w:ascii="Times New Roman" w:hAnsi="Times New Roman" w:eastAsia="Times New Roman"/>
           <w:sz w:val="24"/>
         </w:rPr>
-        <w:t>A hipótese geral da Etapa 1 permanece válida: a adoção da plataforma PlayHub melhora a eficiência operacional, a transparência das informações e a experiência dos usuários em comparação aos métodos tradicionais. Para a Etapa 2, essa hipótese foi desdobrada em hipóteses operacionais, permitindo melhor mensuração na etapa de coleta e análise de dados.</w:t>
+        <w:t>Como hipótese de trabalho, considera-se que a adoção do PlayHub pode melhorar a eficiência operacional, a transparência das informações e a experiência dos usuários em comparação aos métodos tradicionais de organização por mensagens, planilhas e controles manuais. As hipóteses abaixo têm função orientadora para a coleta e análise dos dados, sem pretensão de generalização ampla.</w:t>
+      </w:r>
+    </w:p>
+    <w:p>
+      <w:r>
+        <w:br w:type="page"/>
       </w:r>
     </w:p>
     <w:p>
@@ -2346,7 +2533,7 @@
                     <pic:cNvPicPr/>
                   </pic:nvPicPr>
                   <pic:blipFill>
-                    <a:blip r:embed="rId10"/>
+                    <a:blip r:embed="rId11"/>
                     <a:stretch>
                       <a:fillRect/>
                     </a:stretch>
@@ -2449,7 +2636,12 @@
           <w:rFonts w:ascii="Times New Roman" w:hAnsi="Times New Roman" w:eastAsia="Times New Roman"/>
           <w:sz w:val="24"/>
         </w:rPr>
-        <w:t>H4: a governança digital assistida e a coordenação digital atuam como mecanismos explicativos entre a adoção da plataforma e os resultados percebidos.</w:t>
+        <w:t>H4: a governança digital assistida e a coordenação digital podem ajudar a explicar parte dos resultados percebidos pelos usuários.</w:t>
+      </w:r>
+    </w:p>
+    <w:p>
+      <w:r>
+        <w:br w:type="page"/>
       </w:r>
     </w:p>
     <w:p>
@@ -3195,7 +3387,7 @@
           <w:rFonts w:ascii="Times New Roman" w:hAnsi="Times New Roman" w:eastAsia="Times New Roman"/>
           <w:sz w:val="24"/>
         </w:rPr>
-        <w:t>A pesquisa é classificada como científica aplicada, pois busca produzir conhecimento sobre o impacto de tecnologias digitais em um contexto real de serviços esportivos amadores, com potencial de orientar decisões práticas de gestão e desenvolvimento de plataformas. Embora exista desenvolvimento tecnológico associado ao PlayHub, o foco do artigo não é apenas relatar a construção do software, mas testar hipóteses sobre seus efeitos percebidos.</w:t>
+        <w:t>A pesquisa é classificada como aplicada, pois busca analisar uma solução digital em um contexto real de serviços esportivos amadores, com potencial de orientar decisões práticas de gestão e desenvolvimento da própria plataforma. Embora exista desenvolvimento tecnológico associado ao PlayHub, o foco do trabalho não é apenas relatar a construção do software, mas avaliar indícios sobre seus efeitos percebidos.</w:t>
       </w:r>
     </w:p>
     <w:p>
@@ -3209,7 +3401,7 @@
           <w:rFonts w:ascii="Times New Roman" w:hAnsi="Times New Roman" w:eastAsia="Times New Roman"/>
           <w:sz w:val="24"/>
         </w:rPr>
-        <w:t>Quanto ao objetivo, a pesquisa é explicativa, com componentes descritivos. É explicativa porque busca analisar a relação entre adoção da plataforma e variações em eficiência, transparência e experiência do usuário. É descritiva porque também caracteriza o contexto, o perfil dos participantes e as práticas de organização antes e depois da adoção.</w:t>
+        <w:t>Quanto ao objetivo, a pesquisa é descritiva e exploratória, com componente analítico. É descritiva porque caracteriza o contexto, o perfil dos participantes e as práticas de organização antes e depois da adoção. É exploratória porque observa um caso específico, ainda em fase de aplicação, buscando identificar tendências e pontos de atenção sem extrapolar os resultados para todos os grupos esportivos amadores.</w:t>
       </w:r>
     </w:p>
     <w:p>
@@ -3254,7 +3446,7 @@
           <w:rFonts w:ascii="Times New Roman" w:hAnsi="Times New Roman" w:eastAsia="Times New Roman"/>
           <w:sz w:val="24"/>
         </w:rPr>
-        <w:t>O delineamento adotado é um estudo de caso único com desenho quase-experimental pré e pós-implementação, sem grupo controle. A escolha se justifica porque o PlayHub será analisado em um ambiente real, no qual não é viável controlar todas as variáveis externas, mas é possível comparar percepções e indicadores antes e depois da intervenção.</w:t>
+        <w:t>O delineamento adotado é um estudo de caso único com comparação pré e pós-uso da plataforma, sem grupo controle. A escolha se justifica porque o PlayHub será analisado em um ambiente real, no qual não é viável controlar todas as variáveis externas, mas é possível comparar percepções e alguns indicadores antes e depois da intervenção.</w:t>
       </w:r>
     </w:p>
     <w:p>
@@ -3313,7 +3505,7 @@
           <w:rFonts w:ascii="Times New Roman" w:hAnsi="Times New Roman" w:eastAsia="Times New Roman"/>
           <w:sz w:val="24"/>
         </w:rPr>
-        <w:t>A amostra é não probabilística, por conveniência e intencionalidade, composta por administradores e atletas que utilizarem a plataforma durante o período de observação. A rodada piloto prevista considera participantes com papéis distintos - administradores e jogadores - para permitir comparação entre a percepção de quem gerencia e a de quem consome o serviço. Caso novos grupos sejam incorporados até a Etapa 3, a amostra poderá ser ampliada mantendo os mesmos instrumentos.</w:t>
+        <w:t>A amostra é não probabilística, por conveniência e intencionalidade, composta por administradores e atletas que utilizarem a plataforma durante o período de observação. A rodada piloto prevista considera participantes com papéis distintos - administradores e jogadores - para permitir comparação entre a percepção de quem gerencia e a de quem consome o serviço. Caso novos grupos sejam incorporados posteriormente, a amostra poderá ser ampliada mantendo os mesmos instrumentos.</w:t>
       </w:r>
     </w:p>
     <w:p>
@@ -3359,6 +3551,11 @@
           <w:sz w:val="24"/>
         </w:rPr>
         <w:t>Os questionários utilizarão escala Likert de cinco pontos para medir clareza, facilidade, transparência e esforço percebido. Para recomendação, será utilizada escala de 0 a 10. Administradores também informarão tempo aproximado gasto em rotinas de gestão antes e depois da adoção. Sempre que possível, esses dados serão comparados com evidências operacionais do sistema, como registros de presença, ciclo financeiro e uso de notificações.</w:t>
+      </w:r>
+    </w:p>
+    <w:p>
+      <w:r>
+        <w:br w:type="page"/>
       </w:r>
     </w:p>
     <w:p>
@@ -3928,7 +4125,7 @@
           <w:rFonts w:ascii="Times New Roman" w:hAnsi="Times New Roman" w:eastAsia="Times New Roman"/>
           <w:sz w:val="24"/>
         </w:rPr>
-        <w:t>Os dados serão analisados por estatística descritiva, incluindo média, mediana, frequência, variação percentual e comparação de médias pré e pós-adoção. Para amostras pequenas, a interpretação priorizará a magnitude da diferença e a coerência com o referencial teórico. Caso a amostra seja ampliada, poderão ser aplicados testes não paramétricos, como Wilcoxon para dados pareados, ou teste t pareado quando os pressupostos forem atendidos.</w:t>
+        <w:t>Os dados serão analisados por estatística descritiva, incluindo média, mediana, frequência, variação percentual e comparação de resultados pré e pós-adoção. Considerando o caráter aplicado e possivelmente limitado da amostra, a interpretação priorizará a magnitude das diferenças observadas e a coerência com o referencial teórico. Se a amostra for suficiente, poderão ser aplicados testes simples para comparação de medidas pareadas.</w:t>
       </w:r>
     </w:p>
     <w:p>
@@ -3942,7 +4139,7 @@
           <w:rFonts w:ascii="Times New Roman" w:hAnsi="Times New Roman" w:eastAsia="Times New Roman"/>
           <w:sz w:val="24"/>
         </w:rPr>
-        <w:t>A análise qualitativa complementar será aplicada a respostas abertas e observações dos administradores, buscando explicar por que determinados indicadores melhoraram, permaneceram estáveis ou pioraram. Essa etapa será utilizada para discutir resultados à luz de coordenação digital, governança assistida e experiência do usuário, conforme os autores do referencial teórico.</w:t>
+        <w:t>A análise qualitativa complementar será aplicada a respostas abertas e observações dos administradores, buscando interpretar por que determinados indicadores melhoraram, permaneceram estáveis ou pioraram. Essa análise será utilizada para discutir os resultados à luz de coordenação digital, governança assistida e experiência do usuário, conforme os autores do referencial teórico.</w:t>
       </w:r>
     </w:p>
     <w:p>
@@ -4004,7 +4201,7 @@
           <w:color w:val="1F2937"/>
           <w:sz w:val="24"/>
         </w:rPr>
-        <w:t>7 CONTRIBUIÇÃO ESPERADA</w:t>
+        <w:t>7 POTENCIAIS CONTRIBUIÇÕES E LIMITAÇÕES</w:t>
       </w:r>
     </w:p>
     <w:p>
@@ -4018,7 +4215,7 @@
           <w:rFonts w:ascii="Times New Roman" w:hAnsi="Times New Roman" w:eastAsia="Times New Roman"/>
           <w:sz w:val="24"/>
         </w:rPr>
-        <w:t>A contribuição acadêmica esperada é demonstrar como a transformação digital pode ser analisada em sistemas produtivos informais e de pequena escala, ampliando a discussão para além de indústrias, grandes organizações e serviços altamente formalizados. Ao articular transformação digital, ecossistemas de plataforma, coordenação de equipes esportivas e experiência do usuário, o estudo propõe um modelo aplicável ao esporte amador.</w:t>
+        <w:t>A contribuição acadêmica esperada é discutir, em escala limitada, como a transformação digital pode ser observada em sistemas produtivos informais e de pequena escala. Ao articular transformação digital, plataformas digitais, coordenação de equipes esportivas e experiência do usuário, o estudo oferece uma leitura inicial aplicável ao contexto do esporte amador.</w:t>
       </w:r>
     </w:p>
     <w:p>
@@ -4032,7 +4229,7 @@
           <w:rFonts w:ascii="Times New Roman" w:hAnsi="Times New Roman" w:eastAsia="Times New Roman"/>
           <w:sz w:val="24"/>
         </w:rPr>
-        <w:t>A contribuição prática é oferecer evidências para o desenvolvimento de soluções digitais que reduzam sobrecarga operacional, aumentem transparência e melhorem a experiência de usuários em comunidades esportivas. Para gestores voluntários, a plataforma pode reduzir atividades repetitivas e conflitos associados à aplicação manual de regras. Para atletas, pode melhorar acesso à informação, previsibilidade e participação.</w:t>
+        <w:t>A contribuição prática é levantar indícios para o desenvolvimento de soluções digitais que reduzam sobrecarga operacional, aumentem transparência e melhorem a experiência de usuários em comunidades esportivas. Para gestores voluntários, a plataforma pode reduzir atividades repetitivas e conflitos associados à aplicação manual de regras. Para atletas, pode melhorar acesso à informação, previsibilidade e participação.</w:t>
       </w:r>
     </w:p>
     <w:p>
@@ -4049,7 +4246,7 @@
           <w:color w:val="1F2937"/>
           <w:sz w:val="24"/>
         </w:rPr>
-        <w:t>8 CONSIDERAÇÕES PARCIAIS DA ETAPA 2</w:t>
+        <w:t>8 CONSIDERAÇÕES PARCIAIS</w:t>
       </w:r>
     </w:p>
     <w:p>
@@ -4063,7 +4260,7 @@
           <w:rFonts w:ascii="Times New Roman" w:hAnsi="Times New Roman" w:eastAsia="Times New Roman"/>
           <w:sz w:val="24"/>
         </w:rPr>
-        <w:t>A Etapa 2 consolidou a continuidade da pesquisa iniciada na Etapa 1, mantendo a questão central e a hipótese geral, mas refinando a estrutura científica do trabalho. O PlayHub passa a ser analisado como intervenção de transformação digital em um sistema produtivo informal de serviços esportivos, com variáveis dependentes claramente definidas: eficiência operacional, transparência das informações e experiência do usuário.</w:t>
+        <w:t>O trabalho organiza a pesquisa sobre o PlayHub como uma análise aplicada de transformação digital em um sistema produtivo informal de serviços esportivos. A proposta delimita três dimensões principais de observação: eficiência operacional, transparência das informações e experiência do usuário.</w:t>
       </w:r>
     </w:p>
     <w:p>
@@ -4077,7 +4274,7 @@
           <w:rFonts w:ascii="Times New Roman" w:hAnsi="Times New Roman" w:eastAsia="Times New Roman"/>
           <w:sz w:val="24"/>
         </w:rPr>
-        <w:t>O referencial teórico selecionado fortalece a pesquisa por conectar o caso a discussões atuais sobre plataformas digitais, co-criação de valor, práticas sociais em comunidades esportivas, coordenação digital de equipes amadoras, governança por algoritmos e experiência do usuário em sistemas computacionais. A próxima etapa deverá executar os procedimentos de coleta, organizar os dados em tabelas e gráficos e iniciar a análise dos resultados à luz das hipóteses aqui formuladas.</w:t>
+        <w:t>O referencial teórico selecionado conecta o caso a discussões atuais sobre plataformas digitais, co-criação de valor, práticas sociais em comunidades esportivas, coordenação digital de equipes amadoras, governança assistida e experiência do usuário em sistemas computacionais. A continuidade do trabalho dependerá da aprovação ética, da aplicação dos questionários e da análise cautelosa dos dados coletados.</w:t>
       </w:r>
     </w:p>
     <w:p>
@@ -4127,35 +4324,7 @@
           <w:rFonts w:ascii="Times New Roman" w:hAnsi="Times New Roman" w:eastAsia="Times New Roman"/>
           <w:sz w:val="24"/>
         </w:rPr>
-        <w:t>CHAI, Hongqin et al. Digital transformation in physical education: a bibliometric analysis of global trends, hotspots, and future directions through CiteSpace. SAGE Open, v. 15, 2025. DOI: 10.1177/21582440251395582.</w:t>
-      </w:r>
-    </w:p>
-    <w:p>
-      <w:pPr>
-        <w:spacing w:line="240" w:lineRule="auto" w:after="120"/>
-        <w:ind w:firstLine="0"/>
-        <w:jc w:val="left"/>
-      </w:pPr>
-      <w:r>
-        <w:rPr>
-          <w:rFonts w:ascii="Times New Roman" w:hAnsi="Times New Roman" w:eastAsia="Times New Roman"/>
-          <w:sz w:val="24"/>
-        </w:rPr>
         <w:t>DE LEON, Frediezel et al. Digital transformation COVID-19 era: startup strategies for technology, management, and people. International Journal of Advances in Applied Sciences, v. 14, n. 1, p. 11-18, 2025. DOI: 10.11591/ijaas.v14.i1.pp11-18.</w:t>
-      </w:r>
-    </w:p>
-    <w:p>
-      <w:pPr>
-        <w:spacing w:line="240" w:lineRule="auto" w:after="120"/>
-        <w:ind w:firstLine="0"/>
-        <w:jc w:val="left"/>
-      </w:pPr>
-      <w:r>
-        <w:rPr>
-          <w:rFonts w:ascii="Times New Roman" w:hAnsi="Times New Roman" w:eastAsia="Times New Roman"/>
-          <w:sz w:val="24"/>
-        </w:rPr>
-        <w:t>ELSHAWESH, Yousef; WADA, Isah. Service quality and customer satisfaction: the mediating role of customer delight. International Review of Management and Marketing, v. 16, n. 2, p. 273-287, 2026. DOI: 10.32479/irmm.21607.</w:t>
       </w:r>
     </w:p>
     <w:p>
@@ -4299,11 +4468,10 @@
       </w:r>
     </w:p>
     <w:sectPr>
-      <w:headerReference w:type="default" r:id="rId9"/>
+      <w:headerReference w:type="default" r:id="rId10"/>
       <w:pgSz w:w="12240" w:h="15840"/>
       <w:pgMar w:top="1701" w:right="1134" w:bottom="1134" w:left="1701" w:header="709" w:footer="720" w:gutter="0"/>
       <w:cols w:space="720"/>
-      <w:titlePg/>
       <w:docGrid w:linePitch="360"/>
     </w:sectPr>
   </w:body>
@@ -4311,6 +4479,16 @@
 </file>
 
 <file path=word/header1.xml><?xml version="1.0" encoding="utf-8"?>
+<w:hdr xmlns:m="http://schemas.openxmlformats.org/officeDocument/2006/math" xmlns:mc="http://schemas.openxmlformats.org/markup-compatibility/2006" xmlns:mo="http://schemas.microsoft.com/office/mac/office/2008/main" xmlns:mv="urn:schemas-microsoft-com:mac:vml" xmlns:o="urn:schemas-microsoft-com:office:office" xmlns:r="http://schemas.openxmlformats.org/officeDocument/2006/relationships" xmlns:v="urn:schemas-microsoft-com:vml" xmlns:w10="urn:schemas-microsoft-com:office:word" xmlns:w14="http://schemas.microsoft.com/office/word/2010/wordml" xmlns:w="http://schemas.openxmlformats.org/wordprocessingml/2006/main" xmlns:wne="http://schemas.microsoft.com/office/word/2006/wordml" xmlns:wp14="http://schemas.microsoft.com/office/word/2010/wordprocessingDrawing" xmlns:wp="http://schemas.openxmlformats.org/drawingml/2006/wordprocessingDrawing" xmlns:wpc="http://schemas.microsoft.com/office/word/2010/wordprocessingCanvas" xmlns:wpg="http://schemas.microsoft.com/office/word/2010/wordprocessingGroup" xmlns:wpi="http://schemas.microsoft.com/office/word/2010/wordprocessingInk" xmlns:wps="http://schemas.microsoft.com/office/word/2010/wordprocessingShape" mc:Ignorable="w14 wp14">
+  <w:p>
+    <w:pPr>
+      <w:pStyle w:val="Header"/>
+    </w:pPr>
+  </w:p>
+</w:hdr>
+</file>
+
+<file path=word/header2.xml><?xml version="1.0" encoding="utf-8"?>
 <w:hdr xmlns:m="http://schemas.openxmlformats.org/officeDocument/2006/math" xmlns:mc="http://schemas.openxmlformats.org/markup-compatibility/2006" xmlns:mo="http://schemas.microsoft.com/office/mac/office/2008/main" xmlns:mv="urn:schemas-microsoft-com:mac:vml" xmlns:o="urn:schemas-microsoft-com:office:office" xmlns:r="http://schemas.openxmlformats.org/officeDocument/2006/relationships" xmlns:v="urn:schemas-microsoft-com:vml" xmlns:w10="urn:schemas-microsoft-com:office:word" xmlns:w14="http://schemas.microsoft.com/office/word/2010/wordml" xmlns:w="http://schemas.openxmlformats.org/wordprocessingml/2006/main" xmlns:wne="http://schemas.microsoft.com/office/word/2006/wordml" xmlns:wp14="http://schemas.microsoft.com/office/word/2010/wordprocessingDrawing" xmlns:wp="http://schemas.openxmlformats.org/drawingml/2006/wordprocessingDrawing" xmlns:wpc="http://schemas.microsoft.com/office/word/2010/wordprocessingCanvas" xmlns:wpg="http://schemas.microsoft.com/office/word/2010/wordprocessingGroup" xmlns:wpi="http://schemas.microsoft.com/office/word/2010/wordprocessingInk" xmlns:wps="http://schemas.microsoft.com/office/word/2010/wordprocessingShape" mc:Ignorable="w14 wp14">
   <w:p>
     <w:pPr>

</xml_diff>